<commit_message>
docs: upresneni reseni zmeny klienta Z1 a aktualizace obou docx souboru
</commit_message>
<xml_diff>
--- a/semestral documentation/PPRO-dokumentace-Rezervace-v-ordinaci.docx
+++ b/semestral documentation/PPRO-dokumentace-Rezervace-v-ordinaci.docx
@@ -242,11 +242,11 @@
             <w:r>
               <w:rPr>
                 <w:b w:val="0"/>
-                <w:i/>
-                <w:color w:val="767676"/>
+                <w:i w:val="0"/>
+                <w:color w:val="000000"/>
                 <w:sz w:val="20"/>
               </w:rPr>
-              <w:t>[Doplňte odkaz na repozitář na GitHubu]</w:t>
+              <w:t>https://github.com/Poky4/PPRO</w:t>
             </w:r>
           </w:p>
         </w:tc>
@@ -1530,6 +1530,7 @@
                 <w:color w:val="000000"/>
                 <w:sz w:val="18"/>
               </w:rPr>
+              <w:t>R10</w:t>
             </w:r>
           </w:p>
         </w:tc>
@@ -1555,6 +1556,7 @@
                 <w:color w:val="000000"/>
                 <w:sz w:val="18"/>
               </w:rPr>
+              <w:t>Čisté minimalistické záhlaví s fialovým akcentem a odstranění Swagger odkazu z lišty</w:t>
             </w:r>
           </w:p>
         </w:tc>
@@ -1580,6 +1582,7 @@
                 <w:color w:val="000000"/>
                 <w:sz w:val="18"/>
               </w:rPr>
+              <w:t>Přímé zadání klientky (Z1, Z2); odstranění grafických ikonek/log a rámečků u profilu ve prospěch čisté typografie a nerušeného zobrazení uživatele vedle tlačítka odhlášení při zachování fialové barvy.</w:t>
             </w:r>
           </w:p>
         </w:tc>
@@ -1605,6 +1608,7 @@
                 <w:color w:val="000000"/>
                 <w:sz w:val="18"/>
               </w:rPr>
+              <w:t>19. 10. 2026</w:t>
             </w:r>
           </w:p>
         </w:tc>
@@ -1796,6 +1800,141 @@
                 <w:color w:val="000000"/>
                 <w:sz w:val="18"/>
               </w:rPr>
+              <w:t>Z1</w:t>
+            </w:r>
+          </w:p>
+        </w:tc>
+        <w:tc>
+          <w:tcPr>
+            <w:tcW w:type="dxa" w:w="1417"/>
+            <w:tcMar>
+              <w:top w:w="70" w:type="dxa"/>
+              <w:left w:w="100" w:type="dxa"/>
+              <w:bottom w:w="70" w:type="dxa"/>
+              <w:right w:w="100" w:type="dxa"/>
+            </w:tcMar>
+          </w:tcPr>
+          <w:p>
+            <w:pPr>
+              <w:spacing w:before="40" w:after="40"/>
+            </w:pPr>
+            <w:r/>
+            <w:r>
+              <w:rPr>
+                <w:b w:val="0"/>
+                <w:i w:val="0"/>
+                <w:color w:val="000000"/>
+                <w:sz w:val="18"/>
+              </w:rPr>
+              <w:t>19. 10. 2026</w:t>
+            </w:r>
+          </w:p>
+        </w:tc>
+        <w:tc>
+          <w:tcPr>
+            <w:tcW w:type="dxa" w:w="2948"/>
+            <w:tcMar>
+              <w:top w:w="70" w:type="dxa"/>
+              <w:left w:w="100" w:type="dxa"/>
+              <w:bottom w:w="70" w:type="dxa"/>
+              <w:right w:w="100" w:type="dxa"/>
+            </w:tcMar>
+          </w:tcPr>
+          <w:p>
+            <w:pPr>
+              <w:spacing w:before="40" w:after="40"/>
+            </w:pPr>
+            <w:r/>
+            <w:r>
+              <w:rPr>
+                <w:b w:val="0"/>
+                <w:i w:val="0"/>
+                <w:color w:val="000000"/>
+                <w:sz w:val="18"/>
+              </w:rPr>
+              <w:t>„Nelíbí se mi, že aplikace působí jako z generátoru. Nechci tam žádné logo ani křížek, uživatele nechci v žádném rámečku – jen čistě jméno a pod ním roli vedle tlačítka odhlásit. Fialovou barvu ale ponechat a z lišty dát pryč ten Swagger.“</w:t>
+            </w:r>
+          </w:p>
+        </w:tc>
+        <w:tc>
+          <w:tcPr>
+            <w:tcW w:type="dxa" w:w="3288"/>
+            <w:tcMar>
+              <w:top w:w="70" w:type="dxa"/>
+              <w:left w:w="100" w:type="dxa"/>
+              <w:bottom w:w="70" w:type="dxa"/>
+              <w:right w:w="100" w:type="dxa"/>
+            </w:tcMar>
+          </w:tcPr>
+          <w:p>
+            <w:pPr>
+              <w:spacing w:before="40" w:after="40"/>
+            </w:pPr>
+            <w:r/>
+            <w:r>
+              <w:rPr>
+                <w:b w:val="0"/>
+                <w:i w:val="0"/>
+                <w:color w:val="000000"/>
+                <w:sz w:val="18"/>
+              </w:rPr>
+              <w:t>Odstraněna grafická loga a symbol křížku z navigace i přihlašovací obrazovky, ponechána čistá typografie ordinace s fialovým motivem, uživatelský profil v navigaci upraven na bezrámečkový text zarovnaný k tlačítku odhlášení a vývojářský odkaz na Swagger odebrán z klientské lišty. Viz R10.</w:t>
+            </w:r>
+          </w:p>
+        </w:tc>
+        <w:tc>
+          <w:tcPr>
+            <w:tcW w:type="dxa" w:w="1247"/>
+            <w:tcMar>
+              <w:top w:w="70" w:type="dxa"/>
+              <w:left w:w="100" w:type="dxa"/>
+              <w:bottom w:w="70" w:type="dxa"/>
+              <w:right w:w="100" w:type="dxa"/>
+            </w:tcMar>
+          </w:tcPr>
+          <w:p>
+            <w:pPr>
+              <w:spacing w:before="40" w:after="40"/>
+            </w:pPr>
+            <w:r/>
+            <w:r>
+              <w:rPr>
+                <w:b w:val="0"/>
+                <w:i w:val="0"/>
+                <w:color w:val="000000"/>
+                <w:sz w:val="18"/>
+              </w:rPr>
+              <w:t>hotovo</w:t>
+            </w:r>
+          </w:p>
+        </w:tc>
+      </w:tr>
+      <w:tr>
+        <w:trPr>
+          <w:trHeight w:val="624"/>
+        </w:trPr>
+        <w:tc>
+          <w:tcPr>
+            <w:tcW w:type="dxa" w:w="737"/>
+            <w:tcMar>
+              <w:top w:w="70" w:type="dxa"/>
+              <w:left w:w="100" w:type="dxa"/>
+              <w:bottom w:w="70" w:type="dxa"/>
+              <w:right w:w="100" w:type="dxa"/>
+            </w:tcMar>
+          </w:tcPr>
+          <w:p>
+            <w:pPr>
+              <w:spacing w:before="40" w:after="40"/>
+            </w:pPr>
+            <w:r/>
+            <w:r>
+              <w:rPr>
+                <w:b w:val="0"/>
+                <w:i w:val="0"/>
+                <w:color w:val="000000"/>
+                <w:sz w:val="18"/>
+              </w:rPr>
             </w:r>
           </w:p>
         </w:tc>
@@ -1914,7 +2053,20 @@
               <w:right w:w="100" w:type="dxa"/>
             </w:tcMar>
           </w:tcPr>
-          <w:p/>
+          <w:p>
+            <w:pPr>
+              <w:spacing w:before="40" w:after="40"/>
+            </w:pPr>
+            <w:r/>
+            <w:r>
+              <w:rPr>
+                <w:b w:val="0"/>
+                <w:i w:val="0"/>
+                <w:color w:val="000000"/>
+                <w:sz w:val="18"/>
+              </w:rPr>
+            </w:r>
+          </w:p>
         </w:tc>
         <w:tc>
           <w:tcPr>
@@ -1926,7 +2078,20 @@
               <w:right w:w="100" w:type="dxa"/>
             </w:tcMar>
           </w:tcPr>
-          <w:p/>
+          <w:p>
+            <w:pPr>
+              <w:spacing w:before="40" w:after="40"/>
+            </w:pPr>
+            <w:r/>
+            <w:r>
+              <w:rPr>
+                <w:b w:val="0"/>
+                <w:i w:val="0"/>
+                <w:color w:val="000000"/>
+                <w:sz w:val="18"/>
+              </w:rPr>
+            </w:r>
+          </w:p>
         </w:tc>
         <w:tc>
           <w:tcPr>
@@ -1938,7 +2103,20 @@
               <w:right w:w="100" w:type="dxa"/>
             </w:tcMar>
           </w:tcPr>
-          <w:p/>
+          <w:p>
+            <w:pPr>
+              <w:spacing w:before="40" w:after="40"/>
+            </w:pPr>
+            <w:r/>
+            <w:r>
+              <w:rPr>
+                <w:b w:val="0"/>
+                <w:i w:val="0"/>
+                <w:color w:val="000000"/>
+                <w:sz w:val="18"/>
+              </w:rPr>
+            </w:r>
+          </w:p>
         </w:tc>
         <w:tc>
           <w:tcPr>
@@ -1950,7 +2128,20 @@
               <w:right w:w="100" w:type="dxa"/>
             </w:tcMar>
           </w:tcPr>
-          <w:p/>
+          <w:p>
+            <w:pPr>
+              <w:spacing w:before="40" w:after="40"/>
+            </w:pPr>
+            <w:r/>
+            <w:r>
+              <w:rPr>
+                <w:b w:val="0"/>
+                <w:i w:val="0"/>
+                <w:color w:val="000000"/>
+                <w:sz w:val="18"/>
+              </w:rPr>
+            </w:r>
+          </w:p>
         </w:tc>
         <w:tc>
           <w:tcPr>
@@ -1962,7 +2153,20 @@
               <w:right w:w="100" w:type="dxa"/>
             </w:tcMar>
           </w:tcPr>
-          <w:p/>
+          <w:p>
+            <w:pPr>
+              <w:spacing w:before="40" w:after="40"/>
+            </w:pPr>
+            <w:r/>
+            <w:r>
+              <w:rPr>
+                <w:b w:val="0"/>
+                <w:i w:val="0"/>
+                <w:color w:val="000000"/>
+                <w:sz w:val="18"/>
+              </w:rPr>
+            </w:r>
+          </w:p>
         </w:tc>
       </w:tr>
       <w:tr>
@@ -1979,7 +2183,20 @@
               <w:right w:w="100" w:type="dxa"/>
             </w:tcMar>
           </w:tcPr>
-          <w:p/>
+          <w:p>
+            <w:pPr>
+              <w:spacing w:before="40" w:after="40"/>
+            </w:pPr>
+            <w:r/>
+            <w:r>
+              <w:rPr>
+                <w:b w:val="0"/>
+                <w:i w:val="0"/>
+                <w:color w:val="000000"/>
+                <w:sz w:val="18"/>
+              </w:rPr>
+            </w:r>
+          </w:p>
         </w:tc>
         <w:tc>
           <w:tcPr>
@@ -1991,7 +2208,20 @@
               <w:right w:w="100" w:type="dxa"/>
             </w:tcMar>
           </w:tcPr>
-          <w:p/>
+          <w:p>
+            <w:pPr>
+              <w:spacing w:before="40" w:after="40"/>
+            </w:pPr>
+            <w:r/>
+            <w:r>
+              <w:rPr>
+                <w:b w:val="0"/>
+                <w:i w:val="0"/>
+                <w:color w:val="000000"/>
+                <w:sz w:val="18"/>
+              </w:rPr>
+            </w:r>
+          </w:p>
         </w:tc>
         <w:tc>
           <w:tcPr>
@@ -2003,7 +2233,20 @@
               <w:right w:w="100" w:type="dxa"/>
             </w:tcMar>
           </w:tcPr>
-          <w:p/>
+          <w:p>
+            <w:pPr>
+              <w:spacing w:before="40" w:after="40"/>
+            </w:pPr>
+            <w:r/>
+            <w:r>
+              <w:rPr>
+                <w:b w:val="0"/>
+                <w:i w:val="0"/>
+                <w:color w:val="000000"/>
+                <w:sz w:val="18"/>
+              </w:rPr>
+            </w:r>
+          </w:p>
         </w:tc>
         <w:tc>
           <w:tcPr>
@@ -2015,7 +2258,20 @@
               <w:right w:w="100" w:type="dxa"/>
             </w:tcMar>
           </w:tcPr>
-          <w:p/>
+          <w:p>
+            <w:pPr>
+              <w:spacing w:before="40" w:after="40"/>
+            </w:pPr>
+            <w:r/>
+            <w:r>
+              <w:rPr>
+                <w:b w:val="0"/>
+                <w:i w:val="0"/>
+                <w:color w:val="000000"/>
+                <w:sz w:val="18"/>
+              </w:rPr>
+            </w:r>
+          </w:p>
         </w:tc>
         <w:tc>
           <w:tcPr>
@@ -2027,7 +2283,20 @@
               <w:right w:w="100" w:type="dxa"/>
             </w:tcMar>
           </w:tcPr>
-          <w:p/>
+          <w:p>
+            <w:pPr>
+              <w:spacing w:before="40" w:after="40"/>
+            </w:pPr>
+            <w:r/>
+            <w:r>
+              <w:rPr>
+                <w:b w:val="0"/>
+                <w:i w:val="0"/>
+                <w:color w:val="000000"/>
+                <w:sz w:val="18"/>
+              </w:rPr>
+            </w:r>
+          </w:p>
         </w:tc>
       </w:tr>
       <w:tr>
@@ -2044,7 +2313,20 @@
               <w:right w:w="100" w:type="dxa"/>
             </w:tcMar>
           </w:tcPr>
-          <w:p/>
+          <w:p>
+            <w:pPr>
+              <w:spacing w:before="40" w:after="40"/>
+            </w:pPr>
+            <w:r/>
+            <w:r>
+              <w:rPr>
+                <w:b w:val="0"/>
+                <w:i w:val="0"/>
+                <w:color w:val="000000"/>
+                <w:sz w:val="18"/>
+              </w:rPr>
+            </w:r>
+          </w:p>
         </w:tc>
         <w:tc>
           <w:tcPr>
@@ -2056,7 +2338,20 @@
               <w:right w:w="100" w:type="dxa"/>
             </w:tcMar>
           </w:tcPr>
-          <w:p/>
+          <w:p>
+            <w:pPr>
+              <w:spacing w:before="40" w:after="40"/>
+            </w:pPr>
+            <w:r/>
+            <w:r>
+              <w:rPr>
+                <w:b w:val="0"/>
+                <w:i w:val="0"/>
+                <w:color w:val="000000"/>
+                <w:sz w:val="18"/>
+              </w:rPr>
+            </w:r>
+          </w:p>
         </w:tc>
         <w:tc>
           <w:tcPr>
@@ -2068,7 +2363,20 @@
               <w:right w:w="100" w:type="dxa"/>
             </w:tcMar>
           </w:tcPr>
-          <w:p/>
+          <w:p>
+            <w:pPr>
+              <w:spacing w:before="40" w:after="40"/>
+            </w:pPr>
+            <w:r/>
+            <w:r>
+              <w:rPr>
+                <w:b w:val="0"/>
+                <w:i w:val="0"/>
+                <w:color w:val="000000"/>
+                <w:sz w:val="18"/>
+              </w:rPr>
+            </w:r>
+          </w:p>
         </w:tc>
         <w:tc>
           <w:tcPr>
@@ -2080,7 +2388,20 @@
               <w:right w:w="100" w:type="dxa"/>
             </w:tcMar>
           </w:tcPr>
-          <w:p/>
+          <w:p>
+            <w:pPr>
+              <w:spacing w:before="40" w:after="40"/>
+            </w:pPr>
+            <w:r/>
+            <w:r>
+              <w:rPr>
+                <w:b w:val="0"/>
+                <w:i w:val="0"/>
+                <w:color w:val="000000"/>
+                <w:sz w:val="18"/>
+              </w:rPr>
+            </w:r>
+          </w:p>
         </w:tc>
         <w:tc>
           <w:tcPr>
@@ -2092,7 +2413,20 @@
               <w:right w:w="100" w:type="dxa"/>
             </w:tcMar>
           </w:tcPr>
-          <w:p/>
+          <w:p>
+            <w:pPr>
+              <w:spacing w:before="40" w:after="40"/>
+            </w:pPr>
+            <w:r/>
+            <w:r>
+              <w:rPr>
+                <w:b w:val="0"/>
+                <w:i w:val="0"/>
+                <w:color w:val="000000"/>
+                <w:sz w:val="18"/>
+              </w:rPr>
+            </w:r>
+          </w:p>
         </w:tc>
       </w:tr>
       <w:tr>
@@ -2109,7 +2443,20 @@
               <w:right w:w="100" w:type="dxa"/>
             </w:tcMar>
           </w:tcPr>
-          <w:p/>
+          <w:p>
+            <w:pPr>
+              <w:spacing w:before="40" w:after="40"/>
+            </w:pPr>
+            <w:r/>
+            <w:r>
+              <w:rPr>
+                <w:b w:val="0"/>
+                <w:i w:val="0"/>
+                <w:color w:val="000000"/>
+                <w:sz w:val="18"/>
+              </w:rPr>
+            </w:r>
+          </w:p>
         </w:tc>
         <w:tc>
           <w:tcPr>
@@ -2121,7 +2468,20 @@
               <w:right w:w="100" w:type="dxa"/>
             </w:tcMar>
           </w:tcPr>
-          <w:p/>
+          <w:p>
+            <w:pPr>
+              <w:spacing w:before="40" w:after="40"/>
+            </w:pPr>
+            <w:r/>
+            <w:r>
+              <w:rPr>
+                <w:b w:val="0"/>
+                <w:i w:val="0"/>
+                <w:color w:val="000000"/>
+                <w:sz w:val="18"/>
+              </w:rPr>
+            </w:r>
+          </w:p>
         </w:tc>
         <w:tc>
           <w:tcPr>
@@ -2133,7 +2493,20 @@
               <w:right w:w="100" w:type="dxa"/>
             </w:tcMar>
           </w:tcPr>
-          <w:p/>
+          <w:p>
+            <w:pPr>
+              <w:spacing w:before="40" w:after="40"/>
+            </w:pPr>
+            <w:r/>
+            <w:r>
+              <w:rPr>
+                <w:b w:val="0"/>
+                <w:i w:val="0"/>
+                <w:color w:val="000000"/>
+                <w:sz w:val="18"/>
+              </w:rPr>
+            </w:r>
+          </w:p>
         </w:tc>
         <w:tc>
           <w:tcPr>
@@ -2145,7 +2518,20 @@
               <w:right w:w="100" w:type="dxa"/>
             </w:tcMar>
           </w:tcPr>
-          <w:p/>
+          <w:p>
+            <w:pPr>
+              <w:spacing w:before="40" w:after="40"/>
+            </w:pPr>
+            <w:r/>
+            <w:r>
+              <w:rPr>
+                <w:b w:val="0"/>
+                <w:i w:val="0"/>
+                <w:color w:val="000000"/>
+                <w:sz w:val="18"/>
+              </w:rPr>
+            </w:r>
+          </w:p>
         </w:tc>
         <w:tc>
           <w:tcPr>
@@ -2157,7 +2543,20 @@
               <w:right w:w="100" w:type="dxa"/>
             </w:tcMar>
           </w:tcPr>
-          <w:p/>
+          <w:p>
+            <w:pPr>
+              <w:spacing w:before="40" w:after="40"/>
+            </w:pPr>
+            <w:r/>
+            <w:r>
+              <w:rPr>
+                <w:b w:val="0"/>
+                <w:i w:val="0"/>
+                <w:color w:val="000000"/>
+                <w:sz w:val="18"/>
+              </w:rPr>
+            </w:r>
+          </w:p>
         </w:tc>
       </w:tr>
       <w:tr>
@@ -2174,7 +2573,20 @@
               <w:right w:w="100" w:type="dxa"/>
             </w:tcMar>
           </w:tcPr>
-          <w:p/>
+          <w:p>
+            <w:pPr>
+              <w:spacing w:before="40" w:after="40"/>
+            </w:pPr>
+            <w:r/>
+            <w:r>
+              <w:rPr>
+                <w:b w:val="0"/>
+                <w:i w:val="0"/>
+                <w:color w:val="000000"/>
+                <w:sz w:val="18"/>
+              </w:rPr>
+            </w:r>
+          </w:p>
         </w:tc>
         <w:tc>
           <w:tcPr>
@@ -2186,7 +2598,20 @@
               <w:right w:w="100" w:type="dxa"/>
             </w:tcMar>
           </w:tcPr>
-          <w:p/>
+          <w:p>
+            <w:pPr>
+              <w:spacing w:before="40" w:after="40"/>
+            </w:pPr>
+            <w:r/>
+            <w:r>
+              <w:rPr>
+                <w:b w:val="0"/>
+                <w:i w:val="0"/>
+                <w:color w:val="000000"/>
+                <w:sz w:val="18"/>
+              </w:rPr>
+            </w:r>
+          </w:p>
         </w:tc>
         <w:tc>
           <w:tcPr>
@@ -2198,7 +2623,20 @@
               <w:right w:w="100" w:type="dxa"/>
             </w:tcMar>
           </w:tcPr>
-          <w:p/>
+          <w:p>
+            <w:pPr>
+              <w:spacing w:before="40" w:after="40"/>
+            </w:pPr>
+            <w:r/>
+            <w:r>
+              <w:rPr>
+                <w:b w:val="0"/>
+                <w:i w:val="0"/>
+                <w:color w:val="000000"/>
+                <w:sz w:val="18"/>
+              </w:rPr>
+            </w:r>
+          </w:p>
         </w:tc>
         <w:tc>
           <w:tcPr>
@@ -2210,7 +2648,20 @@
               <w:right w:w="100" w:type="dxa"/>
             </w:tcMar>
           </w:tcPr>
-          <w:p/>
+          <w:p>
+            <w:pPr>
+              <w:spacing w:before="40" w:after="40"/>
+            </w:pPr>
+            <w:r/>
+            <w:r>
+              <w:rPr>
+                <w:b w:val="0"/>
+                <w:i w:val="0"/>
+                <w:color w:val="000000"/>
+                <w:sz w:val="18"/>
+              </w:rPr>
+            </w:r>
+          </w:p>
         </w:tc>
         <w:tc>
           <w:tcPr>
@@ -2222,7 +2673,20 @@
               <w:right w:w="100" w:type="dxa"/>
             </w:tcMar>
           </w:tcPr>
-          <w:p/>
+          <w:p>
+            <w:pPr>
+              <w:spacing w:before="40" w:after="40"/>
+            </w:pPr>
+            <w:r/>
+            <w:r>
+              <w:rPr>
+                <w:b w:val="0"/>
+                <w:i w:val="0"/>
+                <w:color w:val="000000"/>
+                <w:sz w:val="18"/>
+              </w:rPr>
+            </w:r>
+          </w:p>
         </w:tc>
       </w:tr>
       <w:tr>
@@ -2239,7 +2703,20 @@
               <w:right w:w="100" w:type="dxa"/>
             </w:tcMar>
           </w:tcPr>
-          <w:p/>
+          <w:p>
+            <w:pPr>
+              <w:spacing w:before="40" w:after="40"/>
+            </w:pPr>
+            <w:r/>
+            <w:r>
+              <w:rPr>
+                <w:b w:val="0"/>
+                <w:i w:val="0"/>
+                <w:color w:val="000000"/>
+                <w:sz w:val="18"/>
+              </w:rPr>
+            </w:r>
+          </w:p>
         </w:tc>
         <w:tc>
           <w:tcPr>
@@ -2251,7 +2728,20 @@
               <w:right w:w="100" w:type="dxa"/>
             </w:tcMar>
           </w:tcPr>
-          <w:p/>
+          <w:p>
+            <w:pPr>
+              <w:spacing w:before="40" w:after="40"/>
+            </w:pPr>
+            <w:r/>
+            <w:r>
+              <w:rPr>
+                <w:b w:val="0"/>
+                <w:i w:val="0"/>
+                <w:color w:val="000000"/>
+                <w:sz w:val="18"/>
+              </w:rPr>
+            </w:r>
+          </w:p>
         </w:tc>
         <w:tc>
           <w:tcPr>
@@ -2263,7 +2753,20 @@
               <w:right w:w="100" w:type="dxa"/>
             </w:tcMar>
           </w:tcPr>
-          <w:p/>
+          <w:p>
+            <w:pPr>
+              <w:spacing w:before="40" w:after="40"/>
+            </w:pPr>
+            <w:r/>
+            <w:r>
+              <w:rPr>
+                <w:b w:val="0"/>
+                <w:i w:val="0"/>
+                <w:color w:val="000000"/>
+                <w:sz w:val="18"/>
+              </w:rPr>
+            </w:r>
+          </w:p>
         </w:tc>
         <w:tc>
           <w:tcPr>
@@ -2275,7 +2778,20 @@
               <w:right w:w="100" w:type="dxa"/>
             </w:tcMar>
           </w:tcPr>
-          <w:p/>
+          <w:p>
+            <w:pPr>
+              <w:spacing w:before="40" w:after="40"/>
+            </w:pPr>
+            <w:r/>
+            <w:r>
+              <w:rPr>
+                <w:b w:val="0"/>
+                <w:i w:val="0"/>
+                <w:color w:val="000000"/>
+                <w:sz w:val="18"/>
+              </w:rPr>
+            </w:r>
+          </w:p>
         </w:tc>
         <w:tc>
           <w:tcPr>
@@ -2287,7 +2803,20 @@
               <w:right w:w="100" w:type="dxa"/>
             </w:tcMar>
           </w:tcPr>
-          <w:p/>
+          <w:p>
+            <w:pPr>
+              <w:spacing w:before="40" w:after="40"/>
+            </w:pPr>
+            <w:r/>
+            <w:r>
+              <w:rPr>
+                <w:b w:val="0"/>
+                <w:i w:val="0"/>
+                <w:color w:val="000000"/>
+                <w:sz w:val="18"/>
+              </w:rPr>
+            </w:r>
+          </w:p>
         </w:tc>
       </w:tr>
       <w:tr>
@@ -2304,7 +2833,20 @@
               <w:right w:w="100" w:type="dxa"/>
             </w:tcMar>
           </w:tcPr>
-          <w:p/>
+          <w:p>
+            <w:pPr>
+              <w:spacing w:before="40" w:after="40"/>
+            </w:pPr>
+            <w:r/>
+            <w:r>
+              <w:rPr>
+                <w:b w:val="0"/>
+                <w:i w:val="0"/>
+                <w:color w:val="000000"/>
+                <w:sz w:val="18"/>
+              </w:rPr>
+            </w:r>
+          </w:p>
         </w:tc>
         <w:tc>
           <w:tcPr>
@@ -2316,7 +2858,20 @@
               <w:right w:w="100" w:type="dxa"/>
             </w:tcMar>
           </w:tcPr>
-          <w:p/>
+          <w:p>
+            <w:pPr>
+              <w:spacing w:before="40" w:after="40"/>
+            </w:pPr>
+            <w:r/>
+            <w:r>
+              <w:rPr>
+                <w:b w:val="0"/>
+                <w:i w:val="0"/>
+                <w:color w:val="000000"/>
+                <w:sz w:val="18"/>
+              </w:rPr>
+            </w:r>
+          </w:p>
         </w:tc>
         <w:tc>
           <w:tcPr>
@@ -2328,7 +2883,20 @@
               <w:right w:w="100" w:type="dxa"/>
             </w:tcMar>
           </w:tcPr>
-          <w:p/>
+          <w:p>
+            <w:pPr>
+              <w:spacing w:before="40" w:after="40"/>
+            </w:pPr>
+            <w:r/>
+            <w:r>
+              <w:rPr>
+                <w:b w:val="0"/>
+                <w:i w:val="0"/>
+                <w:color w:val="000000"/>
+                <w:sz w:val="18"/>
+              </w:rPr>
+            </w:r>
+          </w:p>
         </w:tc>
         <w:tc>
           <w:tcPr>
@@ -2340,7 +2908,20 @@
               <w:right w:w="100" w:type="dxa"/>
             </w:tcMar>
           </w:tcPr>
-          <w:p/>
+          <w:p>
+            <w:pPr>
+              <w:spacing w:before="40" w:after="40"/>
+            </w:pPr>
+            <w:r/>
+            <w:r>
+              <w:rPr>
+                <w:b w:val="0"/>
+                <w:i w:val="0"/>
+                <w:color w:val="000000"/>
+                <w:sz w:val="18"/>
+              </w:rPr>
+            </w:r>
+          </w:p>
         </w:tc>
         <w:tc>
           <w:tcPr>
@@ -2352,72 +2933,20 @@
               <w:right w:w="100" w:type="dxa"/>
             </w:tcMar>
           </w:tcPr>
-          <w:p/>
-        </w:tc>
-      </w:tr>
-      <w:tr>
-        <w:trPr>
-          <w:trHeight w:val="624"/>
-        </w:trPr>
-        <w:tc>
-          <w:tcPr>
-            <w:tcW w:type="dxa" w:w="737"/>
-            <w:tcMar>
-              <w:top w:w="70" w:type="dxa"/>
-              <w:left w:w="100" w:type="dxa"/>
-              <w:bottom w:w="70" w:type="dxa"/>
-              <w:right w:w="100" w:type="dxa"/>
-            </w:tcMar>
-          </w:tcPr>
-          <w:p/>
-        </w:tc>
-        <w:tc>
-          <w:tcPr>
-            <w:tcW w:type="dxa" w:w="1417"/>
-            <w:tcMar>
-              <w:top w:w="70" w:type="dxa"/>
-              <w:left w:w="100" w:type="dxa"/>
-              <w:bottom w:w="70" w:type="dxa"/>
-              <w:right w:w="100" w:type="dxa"/>
-            </w:tcMar>
-          </w:tcPr>
-          <w:p/>
-        </w:tc>
-        <w:tc>
-          <w:tcPr>
-            <w:tcW w:type="dxa" w:w="2948"/>
-            <w:tcMar>
-              <w:top w:w="70" w:type="dxa"/>
-              <w:left w:w="100" w:type="dxa"/>
-              <w:bottom w:w="70" w:type="dxa"/>
-              <w:right w:w="100" w:type="dxa"/>
-            </w:tcMar>
-          </w:tcPr>
-          <w:p/>
-        </w:tc>
-        <w:tc>
-          <w:tcPr>
-            <w:tcW w:type="dxa" w:w="3288"/>
-            <w:tcMar>
-              <w:top w:w="70" w:type="dxa"/>
-              <w:left w:w="100" w:type="dxa"/>
-              <w:bottom w:w="70" w:type="dxa"/>
-              <w:right w:w="100" w:type="dxa"/>
-            </w:tcMar>
-          </w:tcPr>
-          <w:p/>
-        </w:tc>
-        <w:tc>
-          <w:tcPr>
-            <w:tcW w:type="dxa" w:w="1247"/>
-            <w:tcMar>
-              <w:top w:w="70" w:type="dxa"/>
-              <w:left w:w="100" w:type="dxa"/>
-              <w:bottom w:w="70" w:type="dxa"/>
-              <w:right w:w="100" w:type="dxa"/>
-            </w:tcMar>
-          </w:tcPr>
-          <w:p/>
+          <w:p>
+            <w:pPr>
+              <w:spacing w:before="40" w:after="40"/>
+            </w:pPr>
+            <w:r/>
+            <w:r>
+              <w:rPr>
+                <w:b w:val="0"/>
+                <w:i w:val="0"/>
+                <w:color w:val="000000"/>
+                <w:sz w:val="18"/>
+              </w:rPr>
+            </w:r>
+          </w:p>
         </w:tc>
       </w:tr>
     </w:tbl>

</xml_diff>

<commit_message>
docs: upresneni reseni zmeny klienta Z1 v tabulce zmen a README
</commit_message>
<xml_diff>
--- a/semestral documentation/PPRO-dokumentace-Rezervace-v-ordinaci.docx
+++ b/semestral documentation/PPRO-dokumentace-Rezervace-v-ordinaci.docx
@@ -1582,7 +1582,7 @@
                 <w:color w:val="000000"/>
                 <w:sz w:val="18"/>
               </w:rPr>
-              <w:t>Přímé zadání klientky (Z1, Z2); odstranění grafických ikonek/log a rámečků u profilu ve prospěch čisté typografie a nerušeného zobrazení uživatele vedle tlačítka odhlášení při zachování fialové barvy.</w:t>
+              <w:t>Přímé zadání klientky (Z1); odstranění grafických ikonek/log a rámečků u profilu ve prospěch čisté typografie a nerušeného zobrazení uživatele vedle tlačítka odhlášení při zachování fialové barvy.</w:t>
             </w:r>
           </w:p>
         </w:tc>
@@ -1878,7 +1878,7 @@
                 <w:color w:val="000000"/>
                 <w:sz w:val="18"/>
               </w:rPr>
-              <w:t>Odstraněna grafická loga a symbol křížku z navigace i přihlašovací obrazovky, ponechána čistá typografie ordinace s fialovým motivem, uživatelský profil v navigaci upraven na bezrámečkový text zarovnaný k tlačítku odhlášení a vývojářský odkaz na Swagger odebrán z klientské lišty. Viz R10.</w:t>
+              <w:t>V kódu (index.html, style.css) odstraněna veškerá grafická loga i křížek, profil personálu upraven na čistý text bez rámečku harmonicky zarovnaný k tlačítku odhlášení, fialová barva zachována a odkaz na Swagger odstraněn z klientské navigace (přístupný na /docs). Dopad: klidné, čisté a ergonomické rozhraní bez rušivých prvků pro personál. Viz R10.</w:t>
             </w:r>
           </w:p>
         </w:tc>

</xml_diff>